<commit_message>
Prevent trial credit reset per Telegram ID
</commit_message>
<xml_diff>
--- a/TOAN_AAS_HUONG_DAN_SU_DUNG_CHO_KHACH_V1.docx
+++ b/TOAN_AAS_HUONG_DAN_SU_DUNG_CHO_KHACH_V1.docx
@@ -5601,6 +5601,44 @@
         <w:t>Khách đã có ít nhất 1 câu lệnh mẫu để dùng ngay.</w:t>
       </w:r>
     </w:p>
+    <w:p>
+      <w:r>
+        <w:br w:type="page"/>
+      </w:r>
+    </w:p>
+    <w:p>
+      <w:pPr>
+        <w:pStyle w:val="Heading1"/>
+      </w:pPr>
+      <w:r>
+        <w:t>C?P NH?T: XU TR?I NGHI?M THEO ID TELEGRAM</w:t>
+      </w:r>
+    </w:p>
+    <w:p>
+      <w:r>
+        <w:t>M?i ID Telegram ch? nh?n 200 Xu tr?i nghi?m m?t l?n.</w:t>
+      </w:r>
+    </w:p>
+    <w:p>
+      <w:r>
+        <w:t>X?a chat, block bot r?i b?m Start l?i ho?c ??i username kh?ng l?m b?n nh?n l?i 200 Xu.</w:t>
+      </w:r>
+    </w:p>
+    <w:p>
+      <w:r>
+        <w:t>TOAN AAS qu?n l? Xu theo ID Telegram, kh?ng theo n?i dung ?o?n chat.</w:t>
+      </w:r>
+    </w:p>
+    <w:p>
+      <w:r>
+        <w:t>Khi c?n h? tr?, d?ng /myid ho?c /trial_status r?i g?i ID Telegram cho admin/h? tr? ?? ki?m tra.</w:t>
+      </w:r>
+    </w:p>
+    <w:p>
+      <w:r>
+        <w:t>S? d? ???c l?u theo ID Telegram khi h? th?ng DB c?n d? li?u.</w:t>
+      </w:r>
+    </w:p>
     <w:sectPr>
       <w:footerReference w:type="default" r:id="rId9"/>
       <w:pgSz w:w="12240" w:h="15840"/>

</xml_diff>

<commit_message>
Add legal safety framework and terms PDF
</commit_message>
<xml_diff>
--- a/TOAN_AAS_HUONG_DAN_SU_DUNG_CHO_KHACH_V1.docx
+++ b/TOAN_AAS_HUONG_DAN_SU_DUNG_CHO_KHACH_V1.docx
@@ -5639,6 +5639,85 @@
         <w:t>S? d? ???c l?u theo ID Telegram khi h? th?ng DB c?n d? li?u.</w:t>
       </w:r>
     </w:p>
+    <w:p>
+      <w:r>
+        <w:br w:type="page"/>
+      </w:r>
+    </w:p>
+    <w:p>
+      <w:pPr>
+        <w:pStyle w:val="Heading1"/>
+      </w:pPr>
+      <w:r>
+        <w:t>PH? L?C: ?i?u kho?n Xu d?ch v? TOAN AAS</w:t>
+      </w:r>
+    </w:p>
+    <w:p>
+      <w:r>
+        <w:t>Xu d?ch v? TOAN AAS l? ??n v? n?i b? d?ng ?? t?nh l??t s? d?ng c?ng c? AI trong h? th?ng TOAN AAS.</w:t>
+      </w:r>
+    </w:p>
+    <w:p>
+      <w:pPr>
+        <w:pStyle w:val="ListBullet"/>
+      </w:pPr>
+      <w:r>
+        <w:t>Kh?ng ph?i ti?n, ti?n ?i?n t?, t?i s?n s?, ch?ng kho?n ho?c ph??ng ti?n thanh to?n.</w:t>
+      </w:r>
+    </w:p>
+    <w:p>
+      <w:pPr>
+        <w:pStyle w:val="ListBullet"/>
+      </w:pPr>
+      <w:r>
+        <w:t>Kh?ng c? gi? tr? thanh to?n b?n ngo?i TOAN AAS.</w:t>
+      </w:r>
+    </w:p>
+    <w:p>
+      <w:pPr>
+        <w:pStyle w:val="ListBullet"/>
+      </w:pPr>
+      <w:r>
+        <w:t>Kh?ng ???c r?t v? ti?n m?t ho?c chuy?n kho?n.</w:t>
+      </w:r>
+    </w:p>
+    <w:p>
+      <w:pPr>
+        <w:pStyle w:val="ListBullet"/>
+      </w:pPr>
+      <w:r>
+        <w:t>Kh?ng ???c chuy?n nh??ng, mua b?n, trao ??i gi?a ng??i d?ng.</w:t>
+      </w:r>
+    </w:p>
+    <w:p>
+      <w:pPr>
+        <w:pStyle w:val="ListBullet"/>
+      </w:pPr>
+      <w:r>
+        <w:t>Ch? d?ng ?? s? d?ng c?ng c?/d?ch v? trong bot TOAN AAS.</w:t>
+      </w:r>
+    </w:p>
+    <w:p>
+      <w:pPr>
+        <w:pStyle w:val="ListBullet"/>
+      </w:pPr>
+      <w:r>
+        <w:t>C? th? ???c t?ng th?m trong ch??ng tr?nh khuy?n m?i, h? tr? k? thu?t ho?c s? ki?n.</w:t>
+      </w:r>
+    </w:p>
+    <w:p>
+      <w:pPr>
+        <w:pStyle w:val="ListBullet"/>
+      </w:pPr>
+      <w:r>
+        <w:t>TOAN AAS c? quy?n kh?a/thu h?i Xu d?ch v? khuy?n m?i n?u ph?t hi?n gian l?n, spam, l?m d?ng ho?c l?i h? th?ng.</w:t>
+      </w:r>
+    </w:p>
+    <w:p>
+      <w:r>
+        <w:t>Xem nhanh trong bot b?ng l?nh /dieukhoan_xu. ?i?u kho?n s? d?ng ??y ?? c? th? t?i ? /terms ho?c website TOAN AAS.</w:t>
+      </w:r>
+    </w:p>
     <w:sectPr>
       <w:footerReference w:type="default" r:id="rId9"/>
       <w:pgSz w:w="12240" w:h="15840"/>

</xml_diff>

<commit_message>
Improve music SFX media UX and policy docs
</commit_message>
<xml_diff>
--- a/TOAN_AAS_HUONG_DAN_SU_DUNG_CHO_KHACH_V1.docx
+++ b/TOAN_AAS_HUONG_DAN_SU_DUNG_CHO_KHACH_V1.docx
@@ -5718,6 +5718,164 @@
         <w:t>Xem nhanh trong bot b?ng l?nh /dieukhoan_xu. ?i?u kho?n s? d?ng ??y ?? c? th? t?i ? /terms ho?c website TOAN AAS.</w:t>
       </w:r>
     </w:p>
+    <w:p>
+      <w:r>
+        <w:br w:type="page"/>
+      </w:r>
+    </w:p>
+    <w:p>
+      <w:r>
+        <w:br w:type="page"/>
+      </w:r>
+    </w:p>
+    <w:p>
+      <w:pPr>
+        <w:pStyle w:val="Heading2"/>
+      </w:pPr>
+      <w:r>
+        <w:t>14A. NHẠC AI / KHO NHẠC</w:t>
+      </w:r>
+    </w:p>
+    <w:p>
+      <w:r>
+        <w:t>TOAN AAS hỗ trợ tìm nhạc nền, hiệu ứng âm thanh, media public và tạo prompt nhạc cho video.</w:t>
+      </w:r>
+    </w:p>
+    <w:p>
+      <w:r>
+        <w:t>Lệnh chính:</w:t>
+      </w:r>
+    </w:p>
+    <w:p>
+      <w:pPr>
+        <w:pStyle w:val="ListBullet"/>
+      </w:pPr>
+      <w:r>
+        <w:t>/music_tools — mở trung tâm nhạc</w:t>
+      </w:r>
+    </w:p>
+    <w:p>
+      <w:pPr>
+        <w:pStyle w:val="ListBullet"/>
+      </w:pPr>
+      <w:r>
+        <w:t>/music_prompt &lt;mô tả&gt; — tạo prompt nhạc nền</w:t>
+      </w:r>
+    </w:p>
+    <w:p>
+      <w:pPr>
+        <w:pStyle w:val="ListBullet"/>
+      </w:pPr>
+      <w:r>
+        <w:t>/music_library &lt;từ khóa&gt; — tìm nhạc nền</w:t>
+      </w:r>
+    </w:p>
+    <w:p>
+      <w:pPr>
+        <w:pStyle w:val="ListBullet"/>
+      </w:pPr>
+      <w:r>
+        <w:t>/sfx_library &lt;từ khóa&gt; — tìm hiệu ứng âm thanh</w:t>
+      </w:r>
+    </w:p>
+    <w:p>
+      <w:pPr>
+        <w:pStyle w:val="ListBullet"/>
+      </w:pPr>
+      <w:r>
+        <w:t>/media_library &lt;từ khóa&gt; — tìm ảnh/video public</w:t>
+      </w:r>
+    </w:p>
+    <w:p>
+      <w:pPr>
+        <w:pStyle w:val="ListBullet"/>
+      </w:pPr>
+      <w:r>
+        <w:t>/play_music &lt;số&gt; — nghe thử nhạc</w:t>
+      </w:r>
+    </w:p>
+    <w:p>
+      <w:pPr>
+        <w:pStyle w:val="ListBullet"/>
+      </w:pPr>
+      <w:r>
+        <w:t>/play_sfx &lt;số&gt; — nghe thử SFX</w:t>
+      </w:r>
+    </w:p>
+    <w:p>
+      <w:pPr>
+        <w:pStyle w:val="ListBullet"/>
+      </w:pPr>
+      <w:r>
+        <w:t>/select_music &lt;số&gt; — chọn nhạc</w:t>
+      </w:r>
+    </w:p>
+    <w:p>
+      <w:pPr>
+        <w:pStyle w:val="ListBullet"/>
+      </w:pPr>
+      <w:r>
+        <w:t>/select_sfx &lt;số&gt; — chọn SFX</w:t>
+      </w:r>
+    </w:p>
+    <w:p>
+      <w:pPr>
+        <w:pStyle w:val="ListBullet"/>
+      </w:pPr>
+      <w:r>
+        <w:t>/music_policy — chính sách nhạc/media</w:t>
+      </w:r>
+    </w:p>
+    <w:p>
+      <w:r>
+        <w:t>Quy trình gợi ý:</w:t>
+      </w:r>
+    </w:p>
+    <w:p>
+      <w:pPr>
+        <w:pStyle w:val="ListNumber"/>
+      </w:pPr>
+      <w:r>
+        <w:t>Tìm nhạc bằng /music_library.</w:t>
+      </w:r>
+    </w:p>
+    <w:p>
+      <w:pPr>
+        <w:pStyle w:val="ListNumber"/>
+      </w:pPr>
+      <w:r>
+        <w:t>Nghe thử bằng nút hoặc /play_music 1.</w:t>
+      </w:r>
+    </w:p>
+    <w:p>
+      <w:pPr>
+        <w:pStyle w:val="ListNumber"/>
+      </w:pPr>
+      <w:r>
+        <w:t>Chọn bài bằng /select_music 1.</w:t>
+      </w:r>
+    </w:p>
+    <w:p>
+      <w:pPr>
+        <w:pStyle w:val="ListNumber"/>
+      </w:pPr>
+      <w:r>
+        <w:t>Gửi video/ảnh.</w:t>
+      </w:r>
+    </w:p>
+    <w:p>
+      <w:pPr>
+        <w:pStyle w:val="ListNumber"/>
+      </w:pPr>
+      <w:r>
+        <w:t>Dùng /add_music hoặc /image_to_music_video khi công cụ được mở.</w:t>
+      </w:r>
+    </w:p>
+    <w:p>
+      <w:r>
+        <w:t>Lưu ý: Ghép nhạc/video đang admin test nếu chưa mở public. Nhạc/kho public có license riêng. Kiểm tra quyền thương mại, attribution và điều khoản nền tảng trước khi dùng quảng cáo/kiếm tiền. Không yêu cầu bot tạo hoặc dùng nhạc giống nghệ sĩ, ca sĩ, bài hát, giai điệu, beat, bản phối hoặc thương hiệu âm nhạc có bản quyền.</w:t>
+      </w:r>
+    </w:p>
     <w:sectPr>
       <w:footerReference w:type="default" r:id="rId9"/>
       <w:pgSz w:w="12240" w:h="15840"/>

</xml_diff>